<commit_message>
Briefpapier: remove printed field borders
Each fill field was a real bordered table (light-blue outline), not
Word's own non-printing content-control hint -- so it baked into every
printout. Dropped the table border in both files; fields still
highlight on hover/focus in Word, nothing extra prints.

Co-Authored-By: Claude Sonnet 5 <noreply@anthropic.com>
</commit_message>
<xml_diff>
--- a/documenten/Briefpapier zonder footer.docx
+++ b/documenten/Briefpapier zonder footer.docx
@@ -6,10 +6,10 @@
       <w:tblPr>
         <w:tblW w:type="pct" w:w="100%"/>
         <w:tblBorders>
-          <w:top w:val="single" w:color="BFD8E3" w:sz="4"/>
-          <w:left w:val="single" w:color="BFD8E3" w:sz="4"/>
-          <w:bottom w:val="single" w:color="BFD8E3" w:sz="4"/>
-          <w:right w:val="single" w:color="BFD8E3" w:sz="4"/>
+          <w:top w:val="none" w:color="FFFFFF" w:sz="0"/>
+          <w:left w:val="none" w:color="FFFFFF" w:sz="0"/>
+          <w:bottom w:val="none" w:color="FFFFFF" w:sz="0"/>
+          <w:right w:val="none" w:color="FFFFFF" w:sz="0"/>
           <w:insideH w:val="none" w:color="FFFFFF" w:sz="0"/>
           <w:insideV w:val="none" w:color="FFFFFF" w:sz="0"/>
         </w:tblBorders>
@@ -73,10 +73,10 @@
       <w:tblPr>
         <w:tblW w:type="pct" w:w="100%"/>
         <w:tblBorders>
-          <w:top w:val="single" w:color="BFD8E3" w:sz="4"/>
-          <w:left w:val="single" w:color="BFD8E3" w:sz="4"/>
-          <w:bottom w:val="single" w:color="BFD8E3" w:sz="4"/>
-          <w:right w:val="single" w:color="BFD8E3" w:sz="4"/>
+          <w:top w:val="none" w:color="FFFFFF" w:sz="0"/>
+          <w:left w:val="none" w:color="FFFFFF" w:sz="0"/>
+          <w:bottom w:val="none" w:color="FFFFFF" w:sz="0"/>
+          <w:right w:val="none" w:color="FFFFFF" w:sz="0"/>
           <w:insideH w:val="none" w:color="FFFFFF" w:sz="0"/>
           <w:insideV w:val="none" w:color="FFFFFF" w:sz="0"/>
         </w:tblBorders>
@@ -140,10 +140,10 @@
       <w:tblPr>
         <w:tblW w:type="pct" w:w="100%"/>
         <w:tblBorders>
-          <w:top w:val="single" w:color="BFD8E3" w:sz="4"/>
-          <w:left w:val="single" w:color="BFD8E3" w:sz="4"/>
-          <w:bottom w:val="single" w:color="BFD8E3" w:sz="4"/>
-          <w:right w:val="single" w:color="BFD8E3" w:sz="4"/>
+          <w:top w:val="none" w:color="FFFFFF" w:sz="0"/>
+          <w:left w:val="none" w:color="FFFFFF" w:sz="0"/>
+          <w:bottom w:val="none" w:color="FFFFFF" w:sz="0"/>
+          <w:right w:val="none" w:color="FFFFFF" w:sz="0"/>
           <w:insideH w:val="none" w:color="FFFFFF" w:sz="0"/>
           <w:insideV w:val="none" w:color="FFFFFF" w:sz="0"/>
         </w:tblBorders>
@@ -208,10 +208,10 @@
       <w:tblPr>
         <w:tblW w:type="pct" w:w="100%"/>
         <w:tblBorders>
-          <w:top w:val="single" w:color="BFD8E3" w:sz="4"/>
-          <w:left w:val="single" w:color="BFD8E3" w:sz="4"/>
-          <w:bottom w:val="single" w:color="BFD8E3" w:sz="4"/>
-          <w:right w:val="single" w:color="BFD8E3" w:sz="4"/>
+          <w:top w:val="none" w:color="FFFFFF" w:sz="0"/>
+          <w:left w:val="none" w:color="FFFFFF" w:sz="0"/>
+          <w:bottom w:val="none" w:color="FFFFFF" w:sz="0"/>
+          <w:right w:val="none" w:color="FFFFFF" w:sz="0"/>
           <w:insideH w:val="none" w:color="FFFFFF" w:sz="0"/>
           <w:insideV w:val="none" w:color="FFFFFF" w:sz="0"/>
         </w:tblBorders>
@@ -276,10 +276,10 @@
       <w:tblPr>
         <w:tblW w:type="pct" w:w="100%"/>
         <w:tblBorders>
-          <w:top w:val="single" w:color="BFD8E3" w:sz="4"/>
-          <w:left w:val="single" w:color="BFD8E3" w:sz="4"/>
-          <w:bottom w:val="single" w:color="BFD8E3" w:sz="4"/>
-          <w:right w:val="single" w:color="BFD8E3" w:sz="4"/>
+          <w:top w:val="none" w:color="FFFFFF" w:sz="0"/>
+          <w:left w:val="none" w:color="FFFFFF" w:sz="0"/>
+          <w:bottom w:val="none" w:color="FFFFFF" w:sz="0"/>
+          <w:right w:val="none" w:color="FFFFFF" w:sz="0"/>
           <w:insideH w:val="none" w:color="FFFFFF" w:sz="0"/>
           <w:insideV w:val="none" w:color="FFFFFF" w:sz="0"/>
         </w:tblBorders>

</xml_diff>